<commit_message>
Place Gustavo's pasted figures, record Neal's decisions and the Wix how-to, revise the email
Issue files for I2, I3, I5, I6, I7, I9, I13, I14, I15, I16 and I17 record the figures placed on
2026-09-13 under Neal's rule that every pasted figure goes on the page. Edit docs regenerated for
those modules. File 05 records the Core name, the Expert "coming soon" decision, and the steps
for checking the Wix plan, the CMS, Velo and creating an API key. The email to Gustavo drops the
two I2 items Neal resolved and describes the figure placement.

Co-Authored-By: Claude Fable 5.1 <noreply@anthropic.com>
</commit_message>
<xml_diff>
--- a/Module Edit Docs/I14 - Edit Doc.docx
+++ b/Module Edit Docs/I14 - Edit Doc.docx
@@ -28,7 +28,7 @@
           <w:color w:val="B00000"/>
           <w:sz w:val="21"/>
         </w:rPr>
-        <w:t>ISSUES FLAGGED FOR THIS MODULE (6)</w:t>
+        <w:t>ISSUES FLAGGED FOR THIS MODULE (7)</w:t>
       </w:r>
     </w:p>
     <w:p>
@@ -99,6 +99,16 @@
           <w:sz w:val="19"/>
         </w:rPr>
         <w:t>[NOTE: Fixup pass 2026-09-13 applied the missed "technical checks are not separate from the physiology" paragraph after the mechanical-preconditions list. The Magder 119-patient/29 percent active-expiration insertion was not applied: those figures already appear on the page in the fuller paragraph (60 cardiac, 59 non-cardiac, screening detail), and replacing it with the shorter insertion would delete verified detail solely to shorten, which the fixup rules disallow.]</w:t>
+      </w:r>
+    </w:p>
+    <w:p>
+      <w:r>
+        <w:rPr>
+          <w:i/>
+          <w:color w:val="5A5A5A"/>
+          <w:sz w:val="19"/>
+        </w:rPr>
+        <w:t>[NOTE: Gustavo's pasted-figures pass 2026-09-13 placed i14-paste9.png, a redrawn version of the existing tamponade-versus-constriction RAP tracing figure, on a shared numeric scale. Saved as img/i14-tamponade-constriction-gustavo.jpg and inserted immediately after the existing i14-tamponade-constriction.svg figure, with credit to Gustavo García Chávez. It already used RAP labeling, so no Pra/Pmsf clarifying sentence was needed. lint_page.py: 0 problems.]</w:t>
       </w:r>
     </w:p>
     <w:p/>
@@ -1386,6 +1396,61 @@
     </w:p>
     <w:p>
       <w:r>
+        <w:drawing>
+          <wp:inline xmlns:a="http://schemas.openxmlformats.org/drawingml/2006/main" xmlns:pic="http://schemas.openxmlformats.org/drawingml/2006/picture">
+            <wp:extent cx="2834640" cy="1891110"/>
+            <wp:docPr id="9" name="Picture 9"/>
+            <wp:cNvGraphicFramePr>
+              <a:graphicFrameLocks noChangeAspect="1"/>
+            </wp:cNvGraphicFramePr>
+            <a:graphic>
+              <a:graphicData uri="http://schemas.openxmlformats.org/drawingml/2006/picture">
+                <pic:pic>
+                  <pic:nvPicPr>
+                    <pic:cNvPr id="0" name="i14-tamponade-constriction-gustavo.jpg"/>
+                    <pic:cNvPicPr/>
+                  </pic:nvPicPr>
+                  <pic:blipFill>
+                    <a:blip r:embed="rId17"/>
+                    <a:stretch>
+                      <a:fillRect/>
+                    </a:stretch>
+                  </pic:blipFill>
+                  <pic:spPr>
+                    <a:xfrm>
+                      <a:off x="0" y="0"/>
+                      <a:ext cx="2834640" cy="1891110"/>
+                    </a:xfrm>
+                    <a:prstGeom prst="rect"/>
+                  </pic:spPr>
+                </pic:pic>
+              </a:graphicData>
+            </a:graphic>
+          </wp:inline>
+        </w:drawing>
+      </w:r>
+    </w:p>
+    <w:p>
+      <w:r>
+        <w:rPr>
+          <w:color w:val="777777"/>
+          <w:sz w:val="19"/>
+        </w:rPr>
+        <w:t>An alternative rendering of the same three tracings, plotted on a shared numeric scale so the elevation of the tamponade and constriction means can be read directly against the normal trace. Tamponade retains a deep x descent but loses the y descent entirely, so the pressure plateaus high through diastole. Constriction shows both a rapid x descent and a steep, abrupt y descent, producing the M or W contour described in the text. Drawn by Gustavo García Chávez for this module.</w:t>
+      </w:r>
+    </w:p>
+    <w:p>
+      <w:r>
+        <w:rPr>
+          <w:i/>
+          <w:color w:val="C0392B"/>
+          <w:sz w:val="19"/>
+        </w:rPr>
+        <w:t>[Layout note: figure shown small here. On the web it is currently capped at 640px wide. Say if you want it smaller/larger, moved, cropped, or replaced.]</w:t>
+      </w:r>
+    </w:p>
+    <w:p>
+      <w:r>
         <w:t>Both conditions raise the mean right atrial pressure, both equalise the diastolic pressures of all four chambers, and both present with predominantly right-sided heart failure. The mean number is therefore useless for separating them, and the waveform is not. The discriminator is the y descent, and the reason is a difference in when in the cycle the constraint operates.</w:t>
       </w:r>
     </w:p>

</xml_diff>